<commit_message>
refactor: complete request dto separation and contract hardening
</commit_message>
<xml_diff>
--- a/docs/Student_Exam_Result_API_Final_Report.docx
+++ b/docs/Student_Exam_Result_API_Final_Report.docx
@@ -71,15 +71,14 @@
         <w:jc w:val="center"/>
       </w:pPr>
       <w:r>
-        <w:t>Candidate Name: Atharv Singh</w:t>
+        <w:t xml:space="preserve">Candidate Name: Atharv </w:t>
+      </w:r>
+      <w:r>
+        <w:t>Jandial</w:t>
       </w:r>
       <w:r>
         <w:br/>
         <w:t>Course Program: Java &amp; Spring Boot Enterprise Development</w:t>
-      </w:r>
-      <w:r>
-        <w:br/>
-        <w:t>Mentorship Lead: Senior Backend Engineering Committee</w:t>
       </w:r>
       <w:r>
         <w:br/>
@@ -2391,8 +2390,12 @@
       </w:r>
     </w:p>
     <w:sectPr>
-      <w:headerReference w:type="default" r:id="rId8"/>
-      <w:footerReference w:type="default" r:id="rId9"/>
+      <w:headerReference w:type="even" r:id="rId8"/>
+      <w:headerReference w:type="default" r:id="rId9"/>
+      <w:footerReference w:type="even" r:id="rId10"/>
+      <w:footerReference w:type="default" r:id="rId11"/>
+      <w:headerReference w:type="first" r:id="rId12"/>
+      <w:footerReference w:type="first" r:id="rId13"/>
       <w:pgSz w:w="12240" w:h="15840"/>
       <w:pgMar w:top="1440" w:right="1440" w:bottom="1440" w:left="1440" w:header="720" w:footer="720" w:gutter="0"/>
       <w:cols w:space="720"/>
@@ -2433,6 +2436,16 @@
   <w:p>
     <w:pPr>
       <w:pStyle w:val="Footer"/>
+    </w:pPr>
+  </w:p>
+</w:ftr>
+</file>
+
+<file path=word/footer2.xml><?xml version="1.0" encoding="utf-8"?>
+<w:ftr xmlns:wpc="http://schemas.microsoft.com/office/word/2010/wordprocessingCanvas" xmlns:cx="http://schemas.microsoft.com/office/drawing/2014/chartex" xmlns:cx1="http://schemas.microsoft.com/office/drawing/2015/9/8/chartex" xmlns:cx2="http://schemas.microsoft.com/office/drawing/2015/10/21/chartex" xmlns:cx3="http://schemas.microsoft.com/office/drawing/2016/5/9/chartex" xmlns:cx4="http://schemas.microsoft.com/office/drawing/2016/5/10/chartex" xmlns:cx5="http://schemas.microsoft.com/office/drawing/2016/5/11/chartex" xmlns:cx6="http://schemas.microsoft.com/office/drawing/2016/5/12/chartex" xmlns:cx7="http://schemas.microsoft.com/office/drawing/2016/5/13/chartex" xmlns:cx8="http://schemas.microsoft.com/office/drawing/2016/5/14/chartex" xmlns:mc="http://schemas.openxmlformats.org/markup-compatibility/2006" xmlns:aink="http://schemas.microsoft.com/office/drawing/2016/ink" xmlns:am3d="http://schemas.microsoft.com/office/drawing/2017/model3d" xmlns:o="urn:schemas-microsoft-com:office:office" xmlns:oel="http://schemas.microsoft.com/office/2019/extlst" xmlns:r="http://schemas.openxmlformats.org/officeDocument/2006/relationships" xmlns:m="http://schemas.openxmlformats.org/officeDocument/2006/math" xmlns:v="urn:schemas-microsoft-com:vml" xmlns:wp14="http://schemas.microsoft.com/office/word/2010/wordprocessingDrawing" xmlns:wp="http://schemas.openxmlformats.org/drawingml/2006/wordprocessingDrawing" xmlns:w10="urn:schemas-microsoft-com:office:word" xmlns:w="http://schemas.openxmlformats.org/wordprocessingml/2006/main" xmlns:w14="http://schemas.microsoft.com/office/word/2010/wordml" xmlns:w15="http://schemas.microsoft.com/office/word/2012/wordml" xmlns:w16cex="http://schemas.microsoft.com/office/word/2018/wordml/cex" xmlns:w16cid="http://schemas.microsoft.com/office/word/2016/wordml/cid" xmlns:w16="http://schemas.microsoft.com/office/word/2018/wordml" xmlns:w16du="http://schemas.microsoft.com/office/word/2023/wordml/word16du" xmlns:w16sdtdh="http://schemas.microsoft.com/office/word/2020/wordml/sdtdatahash" xmlns:w16sdtfl="http://schemas.microsoft.com/office/word/2024/wordml/sdtformatlock" xmlns:w16se="http://schemas.microsoft.com/office/word/2015/wordml/symex" xmlns:wpg="http://schemas.microsoft.com/office/word/2010/wordprocessingGroup" xmlns:wpi="http://schemas.microsoft.com/office/word/2010/wordprocessingInk" xmlns:wne="http://schemas.microsoft.com/office/word/2006/wordml" xmlns:wps="http://schemas.microsoft.com/office/word/2010/wordprocessingShape" mc:Ignorable="w14 w15 w16se w16cid w16 w16cex w16sdtdh w16sdtfl w16du wp14">
+  <w:p>
+    <w:pPr>
+      <w:pStyle w:val="Footer"/>
       <w:jc w:val="center"/>
     </w:pPr>
     <w:r>
@@ -2440,8 +2453,18 @@
         <w:color w:val="A0AEC0"/>
         <w:sz w:val="17"/>
       </w:rPr>
-      <w:t>Confidential - Internship Deliverable</w:t>
+      <w:t>Internship Deliverable</w:t>
     </w:r>
+  </w:p>
+</w:ftr>
+</file>
+
+<file path=word/footer3.xml><?xml version="1.0" encoding="utf-8"?>
+<w:ftr xmlns:wpc="http://schemas.microsoft.com/office/word/2010/wordprocessingCanvas" xmlns:cx="http://schemas.microsoft.com/office/drawing/2014/chartex" xmlns:cx1="http://schemas.microsoft.com/office/drawing/2015/9/8/chartex" xmlns:cx2="http://schemas.microsoft.com/office/drawing/2015/10/21/chartex" xmlns:cx3="http://schemas.microsoft.com/office/drawing/2016/5/9/chartex" xmlns:cx4="http://schemas.microsoft.com/office/drawing/2016/5/10/chartex" xmlns:cx5="http://schemas.microsoft.com/office/drawing/2016/5/11/chartex" xmlns:cx6="http://schemas.microsoft.com/office/drawing/2016/5/12/chartex" xmlns:cx7="http://schemas.microsoft.com/office/drawing/2016/5/13/chartex" xmlns:cx8="http://schemas.microsoft.com/office/drawing/2016/5/14/chartex" xmlns:mc="http://schemas.openxmlformats.org/markup-compatibility/2006" xmlns:aink="http://schemas.microsoft.com/office/drawing/2016/ink" xmlns:am3d="http://schemas.microsoft.com/office/drawing/2017/model3d" xmlns:o="urn:schemas-microsoft-com:office:office" xmlns:oel="http://schemas.microsoft.com/office/2019/extlst" xmlns:r="http://schemas.openxmlformats.org/officeDocument/2006/relationships" xmlns:m="http://schemas.openxmlformats.org/officeDocument/2006/math" xmlns:v="urn:schemas-microsoft-com:vml" xmlns:wp14="http://schemas.microsoft.com/office/word/2010/wordprocessingDrawing" xmlns:wp="http://schemas.openxmlformats.org/drawingml/2006/wordprocessingDrawing" xmlns:w10="urn:schemas-microsoft-com:office:word" xmlns:w="http://schemas.openxmlformats.org/wordprocessingml/2006/main" xmlns:w14="http://schemas.microsoft.com/office/word/2010/wordml" xmlns:w15="http://schemas.microsoft.com/office/word/2012/wordml" xmlns:w16cex="http://schemas.microsoft.com/office/word/2018/wordml/cex" xmlns:w16cid="http://schemas.microsoft.com/office/word/2016/wordml/cid" xmlns:w16="http://schemas.microsoft.com/office/word/2018/wordml" xmlns:w16du="http://schemas.microsoft.com/office/word/2023/wordml/word16du" xmlns:w16sdtdh="http://schemas.microsoft.com/office/word/2020/wordml/sdtdatahash" xmlns:w16sdtfl="http://schemas.microsoft.com/office/word/2024/wordml/sdtformatlock" xmlns:w16se="http://schemas.microsoft.com/office/word/2015/wordml/symex" xmlns:wpg="http://schemas.microsoft.com/office/word/2010/wordprocessingGroup" xmlns:wpi="http://schemas.microsoft.com/office/word/2010/wordprocessingInk" xmlns:wne="http://schemas.microsoft.com/office/word/2006/wordml" xmlns:wps="http://schemas.microsoft.com/office/word/2010/wordprocessingShape" mc:Ignorable="w14 w15 w16se w16cid w16 w16cex w16sdtdh w16sdtfl w16du wp14">
+  <w:p>
+    <w:pPr>
+      <w:pStyle w:val="Footer"/>
+    </w:pPr>
   </w:p>
 </w:ftr>
 </file>
@@ -2476,6 +2499,16 @@
   <w:p>
     <w:pPr>
       <w:pStyle w:val="Header"/>
+    </w:pPr>
+  </w:p>
+</w:hdr>
+</file>
+
+<file path=word/header2.xml><?xml version="1.0" encoding="utf-8"?>
+<w:hdr xmlns:wpc="http://schemas.microsoft.com/office/word/2010/wordprocessingCanvas" xmlns:cx="http://schemas.microsoft.com/office/drawing/2014/chartex" xmlns:cx1="http://schemas.microsoft.com/office/drawing/2015/9/8/chartex" xmlns:cx2="http://schemas.microsoft.com/office/drawing/2015/10/21/chartex" xmlns:cx3="http://schemas.microsoft.com/office/drawing/2016/5/9/chartex" xmlns:cx4="http://schemas.microsoft.com/office/drawing/2016/5/10/chartex" xmlns:cx5="http://schemas.microsoft.com/office/drawing/2016/5/11/chartex" xmlns:cx6="http://schemas.microsoft.com/office/drawing/2016/5/12/chartex" xmlns:cx7="http://schemas.microsoft.com/office/drawing/2016/5/13/chartex" xmlns:cx8="http://schemas.microsoft.com/office/drawing/2016/5/14/chartex" xmlns:mc="http://schemas.openxmlformats.org/markup-compatibility/2006" xmlns:aink="http://schemas.microsoft.com/office/drawing/2016/ink" xmlns:am3d="http://schemas.microsoft.com/office/drawing/2017/model3d" xmlns:o="urn:schemas-microsoft-com:office:office" xmlns:oel="http://schemas.microsoft.com/office/2019/extlst" xmlns:r="http://schemas.openxmlformats.org/officeDocument/2006/relationships" xmlns:m="http://schemas.openxmlformats.org/officeDocument/2006/math" xmlns:v="urn:schemas-microsoft-com:vml" xmlns:wp14="http://schemas.microsoft.com/office/word/2010/wordprocessingDrawing" xmlns:wp="http://schemas.openxmlformats.org/drawingml/2006/wordprocessingDrawing" xmlns:w10="urn:schemas-microsoft-com:office:word" xmlns:w="http://schemas.openxmlformats.org/wordprocessingml/2006/main" xmlns:w14="http://schemas.microsoft.com/office/word/2010/wordml" xmlns:w15="http://schemas.microsoft.com/office/word/2012/wordml" xmlns:w16cex="http://schemas.microsoft.com/office/word/2018/wordml/cex" xmlns:w16cid="http://schemas.microsoft.com/office/word/2016/wordml/cid" xmlns:w16="http://schemas.microsoft.com/office/word/2018/wordml" xmlns:w16du="http://schemas.microsoft.com/office/word/2023/wordml/word16du" xmlns:w16sdtdh="http://schemas.microsoft.com/office/word/2020/wordml/sdtdatahash" xmlns:w16sdtfl="http://schemas.microsoft.com/office/word/2024/wordml/sdtformatlock" xmlns:w16se="http://schemas.microsoft.com/office/word/2015/wordml/symex" xmlns:wpg="http://schemas.microsoft.com/office/word/2010/wordprocessingGroup" xmlns:wpi="http://schemas.microsoft.com/office/word/2010/wordprocessingInk" xmlns:wne="http://schemas.microsoft.com/office/word/2006/wordml" xmlns:wps="http://schemas.microsoft.com/office/word/2010/wordprocessingShape" mc:Ignorable="w14 w15 w16se w16cid w16 w16cex w16sdtdh w16sdtfl w16du wp14">
+  <w:p>
+    <w:pPr>
+      <w:pStyle w:val="Header"/>
       <w:jc w:val="right"/>
     </w:pPr>
     <w:r>
@@ -2485,6 +2518,16 @@
       </w:rPr>
       <w:t>Student Exam Result API | Final Submission Report</w:t>
     </w:r>
+  </w:p>
+</w:hdr>
+</file>
+
+<file path=word/header3.xml><?xml version="1.0" encoding="utf-8"?>
+<w:hdr xmlns:wpc="http://schemas.microsoft.com/office/word/2010/wordprocessingCanvas" xmlns:cx="http://schemas.microsoft.com/office/drawing/2014/chartex" xmlns:cx1="http://schemas.microsoft.com/office/drawing/2015/9/8/chartex" xmlns:cx2="http://schemas.microsoft.com/office/drawing/2015/10/21/chartex" xmlns:cx3="http://schemas.microsoft.com/office/drawing/2016/5/9/chartex" xmlns:cx4="http://schemas.microsoft.com/office/drawing/2016/5/10/chartex" xmlns:cx5="http://schemas.microsoft.com/office/drawing/2016/5/11/chartex" xmlns:cx6="http://schemas.microsoft.com/office/drawing/2016/5/12/chartex" xmlns:cx7="http://schemas.microsoft.com/office/drawing/2016/5/13/chartex" xmlns:cx8="http://schemas.microsoft.com/office/drawing/2016/5/14/chartex" xmlns:mc="http://schemas.openxmlformats.org/markup-compatibility/2006" xmlns:aink="http://schemas.microsoft.com/office/drawing/2016/ink" xmlns:am3d="http://schemas.microsoft.com/office/drawing/2017/model3d" xmlns:o="urn:schemas-microsoft-com:office:office" xmlns:oel="http://schemas.microsoft.com/office/2019/extlst" xmlns:r="http://schemas.openxmlformats.org/officeDocument/2006/relationships" xmlns:m="http://schemas.openxmlformats.org/officeDocument/2006/math" xmlns:v="urn:schemas-microsoft-com:vml" xmlns:wp14="http://schemas.microsoft.com/office/word/2010/wordprocessingDrawing" xmlns:wp="http://schemas.openxmlformats.org/drawingml/2006/wordprocessingDrawing" xmlns:w10="urn:schemas-microsoft-com:office:word" xmlns:w="http://schemas.openxmlformats.org/wordprocessingml/2006/main" xmlns:w14="http://schemas.microsoft.com/office/word/2010/wordml" xmlns:w15="http://schemas.microsoft.com/office/word/2012/wordml" xmlns:w16cex="http://schemas.microsoft.com/office/word/2018/wordml/cex" xmlns:w16cid="http://schemas.microsoft.com/office/word/2016/wordml/cid" xmlns:w16="http://schemas.microsoft.com/office/word/2018/wordml" xmlns:w16du="http://schemas.microsoft.com/office/word/2023/wordml/word16du" xmlns:w16sdtdh="http://schemas.microsoft.com/office/word/2020/wordml/sdtdatahash" xmlns:w16sdtfl="http://schemas.microsoft.com/office/word/2024/wordml/sdtformatlock" xmlns:w16se="http://schemas.microsoft.com/office/word/2015/wordml/symex" xmlns:wpg="http://schemas.microsoft.com/office/word/2010/wordprocessingGroup" xmlns:wpi="http://schemas.microsoft.com/office/word/2010/wordprocessingInk" xmlns:wne="http://schemas.microsoft.com/office/word/2006/wordml" xmlns:wps="http://schemas.microsoft.com/office/word/2010/wordprocessingShape" mc:Ignorable="w14 w15 w16se w16cid w16 w16cex w16sdtdh w16sdtfl w16du wp14">
+  <w:p>
+    <w:pPr>
+      <w:pStyle w:val="Header"/>
+    </w:pPr>
   </w:p>
 </w:hdr>
 </file>

</xml_diff>